<commit_message>
Neutral project branding; clearer report summaries
- Removed all event and competition references from the README, the original
  project report source, the deck title slide, the LaTeX and Word reports, and the
  demo data (a seeded leave reason and a club event)
- Executive summary and conclusion summary rewritten around the problem, the
  platform and the measured results
- Screenshots recaptured from the reseeded demo data; deck, deck PDF and both
  report PDFs regenerated

Co-Authored-By: Claude Opus 5.5 <noreply@anthropic.com>
</commit_message>
<xml_diff>
--- a/presentation/Demeure_AI_Project_Report.docx
+++ b/presentation/Demeure_AI_Project_Report.docx
@@ -1290,7 +1290,7 @@
           <w:i w:val="0"/>
           <w:sz w:val="24"/>
         </w:rPr>
-        <w:t>Demeure AI is a web-based campus operating system that brings these processes onto one platform. It gives four personas (Campus Administrator, Hostel Administrator/Warden, Mess Manager and Resident Student) a workspace scoped to their responsibilities and keeps every record in one persisted source of truth. The platform began as a prototype for the WebForge Smart Campus Webathon 2026 and was then engineered for production: server-side authentication, role-based authorisation, durable storage, input validation, automated tests and a deployable container image. It also integrates four Amazon Web Services (DynamoDB, S3, SES and Polly) through a hybrid design that runs entirely on one machine when cloud credentials are absent.</w:t>
+        <w:t>Demeure AI is a web-based campus operating system that brings these processes onto one platform. It gives four personas (Campus Administrator, Hostel Administrator/Warden, Mess Manager and Resident Student) a workspace scoped to their responsibilities and keeps every record in one persisted source of truth. The platform began as a prototype and was then engineered for production: server-side authentication, role-based authorisation, durable storage, input validation, automated tests and a deployable container image. It also integrates four Amazon Web Services (DynamoDB, S3, SES and Polly) through a hybrid design that runs entirely on one machine when cloud credentials are absent.</w:t>
       </w:r>
     </w:p>
     <w:p>
@@ -10699,7 +10699,7 @@
           <w:i w:val="0"/>
           <w:sz w:val="24"/>
         </w:rPr>
-        <w:t>Table 5.5 compares the hackathon prototype with this release. Route-level code splitting cut the JavaScript downloaded on first visit by 81% (Fig. 5.3, right): modules such as the Excel parser and the charting library load only on the screens that use them.</w:t>
+        <w:t>Table 5.5 compares the initial prototype with this release. Route-level code splitting cut the JavaScript downloaded on first visit by 81% (Fig. 5.3, right): modules such as the Excel parser and the charting library load only on the screens that use them.</w:t>
       </w:r>
     </w:p>
     <w:p>
@@ -11388,7 +11388,7 @@
           <w:i w:val="0"/>
           <w:sz w:val="24"/>
         </w:rPr>
-        <w:t>Demeure AI turns a hackathon prototype into a deployable campus operating system. It unifies leave and visitor approvals, room allocation, complaints, mess planning, grievances, facilities, billing and payment for four personas on one persisted record. Security is enforced on the server through hashed credentials, signed sessions, role and ownership checks, validated input and private file storage. The hybrid design runs on a single machine or on AWS DynamoDB, S3, SES and Polly without code changes. The intelligent features measured well: the handbook assistant retrieved the right rulebook for every test question and answered 17 of 18 correctly; roommate matching gives every student a best match scoring at least 85 while respecting single-gender blocks; and complaint triage classified all 30 labelled complaints after the word-matching fix. Ten end-to-end scenarios and 32 automated tests pass, and core API calls complete within 3 ms.</w:t>
+        <w:t>Demeure AI turns an initial prototype into a deployable campus operating system. It unifies leave and visitor approvals, room allocation, complaints, mess planning, grievances, facilities, billing and payment for four personas on one persisted record. Security is enforced on the server through hashed credentials, signed sessions, role and ownership checks, validated input and private file storage. The hybrid design runs on a single machine or on AWS DynamoDB, S3, SES and Polly without code changes. The intelligent features measured well: the handbook assistant retrieved the right rulebook for every test question and answered 17 of 18 correctly; roommate matching gives every student a best match scoring at least 85 while respecting single-gender blocks; and complaint triage classified all 30 labelled complaints after the word-matching fix. Ten end-to-end scenarios and 32 automated tests pass, and core API calls complete within 3 ms.</w:t>
       </w:r>
     </w:p>
     <w:p>
@@ -12202,7 +12202,7 @@
                 <w:i w:val="0"/>
                 <w:sz w:val="21"/>
               </w:rPr>
-              <w:t>WebForge hackathon prototype</w:t>
+              <w:t>Working prototype</w:t>
             </w:r>
           </w:p>
         </w:tc>

</xml_diff>